<commit_message>
docs: update travel reproduction result
</commit_message>
<xml_diff>
--- a/engineering/travel/复现结果result.docx
+++ b/engineering/travel/复现结果result.docx
@@ -9,12 +9,12 @@
         <w:spacing w:before="0" w:after="100" w:line="240" w:lineRule="auto"/>
         <w:jc w:val="center"/>
         <w:rPr>
-          <w:rFonts w:hint="eastAsia" w:ascii="宋体" w:hAnsi="宋体" w:eastAsia="宋体" w:cs="宋体"/>
+          <w:rFonts w:hint="eastAsia" w:ascii="黑体" w:hAnsi="黑体" w:eastAsia="黑体" w:cs="黑体"/>
         </w:rPr>
       </w:pPr>
       <w:r>
         <w:rPr>
-          <w:rFonts w:hint="eastAsia" w:ascii="宋体" w:hAnsi="宋体" w:eastAsia="宋体" w:cs="宋体"/>
+          <w:rFonts w:hint="eastAsia" w:ascii="黑体" w:hAnsi="黑体" w:eastAsia="黑体" w:cs="黑体"/>
           <w:b/>
           <w:color w:val="1D1D1F"/>
           <w:sz w:val="44"/>
@@ -136,8 +136,6 @@
         </w:rPr>
         <w:t>为</w:t>
       </w:r>
-      <w:bookmarkStart w:id="0" w:name="_GoBack"/>
-      <w:bookmarkEnd w:id="0"/>
       <w:r>
         <w:rPr>
           <w:rFonts w:hint="eastAsia" w:ascii="宋体" w:hAnsi="宋体" w:eastAsia="宋体" w:cs="宋体"/>
@@ -164,7 +162,7 @@
           <w:color w:val="1D1D1F"/>
           <w:sz w:val="21"/>
         </w:rPr>
-        <w:t>文档中6 张截图，</w:t>
+        <w:t>文档中6张截图，</w:t>
       </w:r>
       <w:r>
         <w:rPr>
@@ -184,17 +182,38 @@
         <w:keepLines w:val="0"/>
         <w:spacing w:before="240" w:after="100" w:line="276" w:lineRule="auto"/>
         <w:rPr>
-          <w:rFonts w:hint="eastAsia" w:ascii="宋体" w:hAnsi="宋体" w:eastAsia="宋体" w:cs="宋体"/>
+          <w:rFonts w:hint="eastAsia" w:ascii="黑体" w:hAnsi="黑体" w:eastAsia="黑体" w:cs="黑体"/>
         </w:rPr>
       </w:pPr>
       <w:r>
         <w:rPr>
-          <w:rFonts w:hint="eastAsia" w:ascii="宋体" w:hAnsi="宋体" w:eastAsia="宋体" w:cs="宋体"/>
+          <w:rFonts w:hint="eastAsia" w:ascii="黑体" w:hAnsi="黑体" w:eastAsia="黑体" w:cs="黑体"/>
           <w:b/>
           <w:color w:val="1D1D1F"/>
           <w:sz w:val="30"/>
         </w:rPr>
-        <w:t>一 复现环境与测试数据</w:t>
+        <w:t>一</w:t>
+      </w:r>
+      <w:r>
+        <w:rPr>
+          <w:rFonts w:hint="eastAsia" w:ascii="黑体" w:hAnsi="黑体" w:eastAsia="黑体" w:cs="黑体"/>
+          <w:b/>
+          <w:color w:val="1D1D1F"/>
+          <w:sz w:val="30"/>
+          <w:lang w:val="en-US" w:eastAsia="zh-CN"/>
+        </w:rPr>
+        <w:t xml:space="preserve"> </w:t>
+      </w:r>
+      <w:bookmarkStart w:id="0" w:name="_GoBack"/>
+      <w:bookmarkEnd w:id="0"/>
+      <w:r>
+        <w:rPr>
+          <w:rFonts w:hint="eastAsia" w:ascii="黑体" w:hAnsi="黑体" w:eastAsia="黑体" w:cs="黑体"/>
+          <w:b/>
+          <w:color w:val="1D1D1F"/>
+          <w:sz w:val="30"/>
+        </w:rPr>
+        <w:t>复现环境与测试数据</w:t>
       </w:r>
     </w:p>
     <w:p>
@@ -213,7 +232,7 @@
           <w:color w:val="1D1D1F"/>
           <w:sz w:val="21"/>
         </w:rPr>
-        <w:t>测试环境：Windows 本机、Microsoft Edge 浏览器、Vue 3 + Vite 前端、FastAPI 后端。当前项目使用 Live 模式，规划链路包含 DeepSeek 大模型、高德 MCP 服务和高德 Web JS 地图。截图内容不包含任何 API Key 或环境变量。</w:t>
+        <w:t>测试环境：Windows本机、MicrosoftEdge浏览器、Vue3+Vite前端、FastAPI后端。当前项目使用Live模式，规划链路包含DeepSeek大模型、高德MCP服务和高德WebJS地图。截图内容不包含任何APIKey或环境变量。</w:t>
       </w:r>
     </w:p>
     <w:p>
@@ -232,7 +251,7 @@
           <w:color w:val="1D1D1F"/>
           <w:sz w:val="21"/>
         </w:rPr>
-        <w:t>测试输入：目的地为乌鲁木齐，旅行日期为 2026-10-14 至 2026-10-16，共 3 天；交通方式为公共交通，住宿偏好为豪华酒店，并选择历史文化、自然风光、美食、购物、艺术和休闲等偏好。</w:t>
+        <w:t>测试输入：目的地为乌鲁木齐，旅行日期为2026-10-14至2026-10-16，共3天；交通方式为公共交通，住宿偏好为豪华酒店，并选择历史文化、自然风光、美食、购物、艺术和休闲等偏好。</w:t>
       </w:r>
     </w:p>
     <w:p>
@@ -251,7 +270,7 @@
           <w:color w:val="1D1D1F"/>
           <w:sz w:val="21"/>
         </w:rPr>
-        <w:t>复现入口：启动前后端后，打开当前地址 http://127.0.0.1:5174/。完整启动命令请参阅同目录下的 USER_STARTUP_GUIDE.md。</w:t>
+        <w:t>复现入口：启动前后端后，打开当前地址http://127.0.0.1:5174/。完整启动命令请参阅同目录下的USER_STARTUP_GUIDE.md。</w:t>
       </w:r>
     </w:p>
     <w:p>
@@ -261,17 +280,36 @@
         <w:keepLines w:val="0"/>
         <w:spacing w:before="240" w:after="100" w:line="276" w:lineRule="auto"/>
         <w:rPr>
-          <w:rFonts w:hint="eastAsia" w:ascii="宋体" w:hAnsi="宋体" w:eastAsia="宋体" w:cs="宋体"/>
+          <w:rFonts w:hint="eastAsia" w:ascii="黑体" w:hAnsi="黑体" w:eastAsia="黑体" w:cs="黑体"/>
         </w:rPr>
       </w:pPr>
       <w:r>
         <w:rPr>
-          <w:rFonts w:hint="eastAsia" w:ascii="宋体" w:hAnsi="宋体" w:eastAsia="宋体" w:cs="宋体"/>
+          <w:rFonts w:hint="eastAsia" w:ascii="黑体" w:hAnsi="黑体" w:eastAsia="黑体" w:cs="黑体"/>
           <w:b/>
           <w:color w:val="1D1D1F"/>
           <w:sz w:val="30"/>
         </w:rPr>
-        <w:t>二 复现总览</w:t>
+        <w:t>二</w:t>
+      </w:r>
+      <w:r>
+        <w:rPr>
+          <w:rFonts w:hint="eastAsia" w:ascii="黑体" w:hAnsi="黑体" w:eastAsia="黑体" w:cs="黑体"/>
+          <w:b/>
+          <w:color w:val="1D1D1F"/>
+          <w:sz w:val="30"/>
+          <w:lang w:val="en-US" w:eastAsia="zh-CN"/>
+        </w:rPr>
+        <w:t xml:space="preserve"> </w:t>
+      </w:r>
+      <w:r>
+        <w:rPr>
+          <w:rFonts w:hint="eastAsia" w:ascii="黑体" w:hAnsi="黑体" w:eastAsia="黑体" w:cs="黑体"/>
+          <w:b/>
+          <w:color w:val="1D1D1F"/>
+          <w:sz w:val="30"/>
+        </w:rPr>
+        <w:t>复现总览</w:t>
       </w:r>
     </w:p>
     <w:tbl>
@@ -532,7 +570,7 @@
                 <w:color w:val="1D1D1F"/>
                 <w:sz w:val="18"/>
               </w:rPr>
-              <w:t>图 1</w:t>
+              <w:t>图1</w:t>
             </w:r>
           </w:p>
         </w:tc>
@@ -706,7 +744,7 @@
                 <w:color w:val="1D1D1F"/>
                 <w:sz w:val="18"/>
               </w:rPr>
-              <w:t>图 2</w:t>
+              <w:t>图2</w:t>
             </w:r>
           </w:p>
         </w:tc>
@@ -823,7 +861,7 @@
                 <w:color w:val="1D1D1F"/>
                 <w:sz w:val="18"/>
               </w:rPr>
-              <w:t>等待 DeepSeek 与高德服务返回</w:t>
+              <w:t>等待DeepSeek与高德服务返回</w:t>
             </w:r>
           </w:p>
         </w:tc>
@@ -882,7 +920,7 @@
                 <w:color w:val="1D1D1F"/>
                 <w:sz w:val="18"/>
               </w:rPr>
-              <w:t>图 3</w:t>
+              <w:t>图3</w:t>
             </w:r>
           </w:p>
         </w:tc>
@@ -958,7 +996,7 @@
                 <w:color w:val="1D1D1F"/>
                 <w:sz w:val="18"/>
               </w:rPr>
-              <w:t>显示乌鲁木齐 3 日方案、地图和概览</w:t>
+              <w:t>显示乌鲁木齐3日方案、地图和概览</w:t>
             </w:r>
           </w:p>
         </w:tc>
@@ -1056,7 +1094,7 @@
                 <w:color w:val="1D1D1F"/>
                 <w:sz w:val="18"/>
               </w:rPr>
-              <w:t>图 4</w:t>
+              <w:t>图4</w:t>
             </w:r>
           </w:p>
         </w:tc>
@@ -1232,7 +1270,7 @@
                 <w:color w:val="1D1D1F"/>
                 <w:sz w:val="18"/>
               </w:rPr>
-              <w:t>图 5</w:t>
+              <w:t>图5</w:t>
             </w:r>
           </w:p>
         </w:tc>
@@ -1406,7 +1444,7 @@
                 <w:color w:val="1D1D1F"/>
                 <w:sz w:val="18"/>
               </w:rPr>
-              <w:t>图 6</w:t>
+              <w:t>图6</w:t>
             </w:r>
           </w:p>
         </w:tc>
@@ -1551,27 +1589,27 @@
         <w:keepLines w:val="0"/>
         <w:spacing w:before="240" w:after="100" w:line="276" w:lineRule="auto"/>
         <w:rPr>
-          <w:rFonts w:hint="eastAsia" w:ascii="宋体" w:hAnsi="宋体" w:eastAsia="宋体" w:cs="宋体"/>
+          <w:rFonts w:hint="eastAsia" w:ascii="黑体" w:hAnsi="黑体" w:eastAsia="黑体" w:cs="黑体"/>
         </w:rPr>
       </w:pPr>
       <w:r>
         <w:rPr>
-          <w:rFonts w:hint="eastAsia" w:ascii="宋体" w:hAnsi="宋体" w:eastAsia="宋体" w:cs="宋体"/>
+          <w:rFonts w:hint="eastAsia" w:ascii="黑体" w:hAnsi="黑体" w:eastAsia="黑体" w:cs="黑体"/>
           <w:b/>
           <w:color w:val="1D1D1F"/>
           <w:sz w:val="30"/>
           <w:lang w:val="en-US" w:eastAsia="zh-CN"/>
         </w:rPr>
-        <w:t>三</w:t>
+        <w:t xml:space="preserve">三 </w:t>
       </w:r>
       <w:r>
         <w:rPr>
-          <w:rFonts w:hint="eastAsia" w:ascii="宋体" w:hAnsi="宋体" w:eastAsia="宋体" w:cs="宋体"/>
+          <w:rFonts w:hint="eastAsia" w:ascii="黑体" w:hAnsi="黑体" w:eastAsia="黑体" w:cs="黑体"/>
           <w:b/>
           <w:color w:val="1D1D1F"/>
           <w:sz w:val="30"/>
         </w:rPr>
-        <w:t xml:space="preserve"> 截图说明</w:t>
+        <w:t>截图说明</w:t>
       </w:r>
     </w:p>
     <w:p>
@@ -1601,7 +1639,7 @@
           <w:color w:val="1D1D1F"/>
           <w:sz w:val="24"/>
         </w:rPr>
-        <w:t>.1 首页输入与主题展示</w:t>
+        <w:t>.1首页输入与主题展示</w:t>
       </w:r>
     </w:p>
     <w:p>
@@ -1691,7 +1729,7 @@
           <w:color w:val="6E6E73"/>
           <w:sz w:val="18"/>
         </w:rPr>
-        <w:t>图 1 首页输入与高级灰主题</w:t>
+        <w:t>图1首页输入与高级灰主题</w:t>
       </w:r>
     </w:p>
     <w:p>
@@ -1721,7 +1759,7 @@
           <w:color w:val="1D1D1F"/>
           <w:sz w:val="24"/>
         </w:rPr>
-        <w:t>.2 DeepSeek 与外部服务调用过程</w:t>
+        <w:t>.2DeepSeek与外部服务调用过程</w:t>
       </w:r>
     </w:p>
     <w:p>
@@ -1740,7 +1778,7 @@
           <w:color w:val="1D1D1F"/>
           <w:sz w:val="21"/>
         </w:rPr>
-        <w:t>确认点击生成后，前端不会停留在无反馈状态，而是向用户说明正在规划并展示进度。完成首页输入后点击生成旅行方案，观察按钮文本、进度条和加载说明；等待接口返回期间不要重复点击。生成按钮变为加载状态，页面出现进度条和“正在整理你的旅行方案”等状态文字，表明前端正在等待后端规划服务。加载状态为用户提供了明确反馈；该阶段对应后端调用 DeepSeek 和高德服务、整理旅行计划数据的过程。</w:t>
+        <w:t>确认点击生成后，前端不会停留在无反馈状态，而是向用户说明正在规划并展示进度。完成首页输入后点击生成旅行方案，观察按钮文本、进度条和加载说明；等待接口返回期间不要重复点击。生成按钮变为加载状态，页面出现进度条和“正在整理你的旅行方案”等状态文字，表明前端正在等待后端规划服务。加载状态为用户提供了明确反馈；该阶段对应后端调用DeepSeek和高德服务、整理旅行计划数据的过程。</w:t>
       </w:r>
     </w:p>
     <w:p>
@@ -1811,7 +1849,7 @@
           <w:color w:val="6E6E73"/>
           <w:sz w:val="18"/>
         </w:rPr>
-        <w:t>图 2 旅行方案生成中的加载反馈</w:t>
+        <w:t>图2旅行方案生成中的加载反馈</w:t>
       </w:r>
     </w:p>
     <w:p>
@@ -1841,7 +1879,7 @@
           <w:color w:val="1D1D1F"/>
           <w:sz w:val="24"/>
         </w:rPr>
-        <w:t>.3 结果页概览与景点地图</w:t>
+        <w:t>.3结果页概览与景点地图</w:t>
       </w:r>
     </w:p>
     <w:p>
@@ -1860,7 +1898,7 @@
           <w:color w:val="1D1D1F"/>
           <w:sz w:val="21"/>
         </w:rPr>
-        <w:t>确认接口返回后能够进入结果页，并同时展示城市、日期、建议文本和高德地图。等待生成完成后进入结果页，在页面顶部查看城市名称和日期，在右侧地图区域检查地图是否加载、景点标记是否出现。页面标题为乌鲁木齐，顶部有“YOUR ITINERARY”标识；左侧为行程概览和建议，右侧为景点地图，地图上出现编号标记。行程结果已成功从后端传递到前端；地图、景点标记和路线区域可用于进一步核对景点坐标与行程顺序。</w:t>
+        <w:t>确认接口返回后能够进入结果页，并同时展示城市、日期、建议文本和高德地图。等待生成完成后进入结果页，在页面顶部查看城市名称和日期，在右侧地图区域检查地图是否加载、景点标记是否出现。页面标题为乌鲁木齐，顶部有“YOURITINERARY”标识；左侧为行程概览和建议，右侧为景点地图，地图上出现编号标记。行程结果已成功从后端传递到前端；地图、景点标记和路线区域可用于进一步核对景点坐标与行程顺序。</w:t>
       </w:r>
     </w:p>
     <w:p>
@@ -1931,7 +1969,7 @@
           <w:color w:val="6E6E73"/>
           <w:sz w:val="18"/>
         </w:rPr>
-        <w:t>图 3 结果页概览与高德地图</w:t>
+        <w:t>图3结果页概览与高德地图</w:t>
       </w:r>
     </w:p>
     <w:p>
@@ -1961,7 +1999,7 @@
           <w:color w:val="1D1D1F"/>
           <w:sz w:val="24"/>
         </w:rPr>
-        <w:t>.4 地图路线与预算明细</w:t>
+        <w:t>.4地图路线与预算明细</w:t>
       </w:r>
     </w:p>
     <w:p>
@@ -1980,7 +2018,7 @@
           <w:color w:val="1D1D1F"/>
           <w:sz w:val="21"/>
         </w:rPr>
-        <w:t>确认地图展示不仅有中心位置，还能支撑多个景点标记；同时核对预算模块是否完成汇总。在结果页向下滚动，查看地图范围和景点编号，再检查预算明细中的门票、住宿、餐饮、交通和总费用。地图区域显示乌鲁木齐及周边道路和多个标记点；左侧预算卡片展示景点门票 ¥240、酒店住宿 ¥2250、餐饮费用 ¥880、交通费用 ¥135，预计总费用为 ¥3505。地图坐标和预算字段均已在结果页正确渲染。预算为当前测试输入下的估算值，实际出行前仍应以官方票价、酒店价格和实时交通为准。</w:t>
+        <w:t>确认地图展示不仅有中心位置，还能支撑多个景点标记；同时核对预算模块是否完成汇总。在结果页向下滚动，查看地图范围和景点编号，再检查预算明细中的门票、住宿、餐饮、交通和总费用。地图区域显示乌鲁木齐及周边道路和多个标记点；左侧预算卡片展示景点门票¥240、酒店住宿¥2250、餐饮费用¥880、交通费用¥135，预计总费用为¥3505。地图坐标和预算字段均已在结果页正确渲染。预算为当前测试输入下的估算值，实际出行前仍应以官方票价、酒店价格和实时交通为准。</w:t>
       </w:r>
     </w:p>
     <w:p>
@@ -2051,7 +2089,7 @@
           <w:color w:val="6E6E73"/>
           <w:sz w:val="18"/>
         </w:rPr>
-        <w:t>图 4 地图路线与预算明细</w:t>
+        <w:t>图4地图路线与预算明细</w:t>
       </w:r>
     </w:p>
     <w:p>
@@ -2081,7 +2119,7 @@
           <w:color w:val="1D1D1F"/>
           <w:sz w:val="24"/>
         </w:rPr>
-        <w:t>.5 每日行程与景点卡片</w:t>
+        <w:t>.5每日行程与景点卡片</w:t>
       </w:r>
     </w:p>
     <w:p>
@@ -2100,7 +2138,7 @@
           <w:color w:val="1D1D1F"/>
           <w:sz w:val="21"/>
         </w:rPr>
-        <w:t>确认多日方案以可读的日程结构展示，并能查看每个景点的名称、地址、时长和描述。在侧边导航点击每日行程，展开第 1 天；检查行程描述、交通、住宿和景点卡片，继续确认第 2 天、第 3 天可以展开。</w:t>
+        <w:t>确认多日方案以可读的日程结构展示，并能查看每个景点的名称、地址、时长和描述。在侧边导航点击每日行程，展开第1天；检查行程描述、交通、住宿和景点卡片，继续确认第2天、第3天可以展开。</w:t>
       </w:r>
     </w:p>
     <w:p>
@@ -2118,7 +2156,7 @@
           <w:color w:val="1D1D1F"/>
           <w:sz w:val="21"/>
         </w:rPr>
-        <w:t>第 1 天面板展开，显示日期、行程描述、交通方式和住宿；下方以卡片形式列出红山公园、人民公园等景点，并显示游览时长和介绍。每日行程数据已按天组织，景点卡片结构完整；该区域也是后续编辑、排序、新增和删除景点功能的主要入口。</w:t>
+        <w:t>第1天面板展开，显示日期、行程描述、交通方式和住宿；下方以卡片形式列出红山公园、人民公园等景点，并显示游览时长和介绍。每日行程数据已按天组织，景点卡片结构完整；该区域也是后续编辑、排序、新增和删除景点功能的主要入口。</w:t>
       </w:r>
     </w:p>
     <w:p>
@@ -2189,7 +2227,7 @@
           <w:color w:val="6E6E73"/>
           <w:sz w:val="18"/>
         </w:rPr>
-        <w:t>图 5 每日行程与景点卡片</w:t>
+        <w:t>图5每日行程与景点卡片</w:t>
       </w:r>
     </w:p>
     <w:p>
@@ -2233,7 +2271,7 @@
           <w:color w:val="1D1D1F"/>
           <w:sz w:val="24"/>
         </w:rPr>
-        <w:t>.6 住宿餐饮与天气信息</w:t>
+        <w:t>.6住宿餐饮与天气信息</w:t>
       </w:r>
     </w:p>
     <w:p>
@@ -2270,7 +2308,7 @@
           <w:color w:val="1D1D1F"/>
           <w:sz w:val="21"/>
         </w:rPr>
-        <w:t>继续向下滚动第 1 天内容，检查住宿推荐、餐饮安排；再查看底部天气信息卡片，核对日期、白天和夜间天气、温度及风力。页面展示乌鲁木齐酒店推荐、早餐午餐晚餐安排，以及 2026-10-14 至 2026-10-16 三天的天气信息和风向风力。旅行计划的景点、住宿、餐饮和天气模块均已形成闭环，满足结果页作为完整旅行方案的基本展示要求。天气和价格属于动态信息，正式使用前应再次查询。</w:t>
+        <w:t>继续向下滚动第1天内容，检查住宿推荐、餐饮安排；再查看底部天气信息卡片，核对日期、白天和夜间天气、温度及风力。页面展示乌鲁木齐酒店推荐、早餐午餐晚餐安排，以及2026-10-14至2026-10-16三天的天气信息和风向风力。旅行计划的景点、住宿、餐饮和天气模块均已形成闭环，满足结果页作为完整旅行方案的基本展示要求。天气和价格属于动态信息，正式使用前应再次查询。</w:t>
       </w:r>
     </w:p>
     <w:p>
@@ -2341,7 +2379,7 @@
           <w:color w:val="6E6E73"/>
           <w:sz w:val="18"/>
         </w:rPr>
-        <w:t>图 6 住宿餐饮与天气信息</w:t>
+        <w:t>图6住宿餐饮与天气信息</w:t>
       </w:r>
     </w:p>
     <w:p>
@@ -2351,27 +2389,27 @@
         <w:keepLines w:val="0"/>
         <w:spacing w:before="240" w:after="100" w:line="276" w:lineRule="auto"/>
         <w:rPr>
-          <w:rFonts w:hint="eastAsia" w:ascii="宋体" w:hAnsi="宋体" w:eastAsia="宋体" w:cs="宋体"/>
+          <w:rFonts w:hint="eastAsia" w:ascii="黑体" w:hAnsi="黑体" w:eastAsia="黑体" w:cs="黑体"/>
         </w:rPr>
       </w:pPr>
       <w:r>
         <w:rPr>
-          <w:rFonts w:hint="eastAsia" w:ascii="宋体" w:hAnsi="宋体" w:eastAsia="宋体" w:cs="宋体"/>
+          <w:rFonts w:hint="eastAsia" w:ascii="黑体" w:hAnsi="黑体" w:eastAsia="黑体" w:cs="黑体"/>
           <w:b/>
           <w:color w:val="1D1D1F"/>
           <w:sz w:val="30"/>
           <w:lang w:val="en-US" w:eastAsia="zh-CN"/>
         </w:rPr>
-        <w:t>四</w:t>
+        <w:t xml:space="preserve">四 </w:t>
       </w:r>
       <w:r>
         <w:rPr>
-          <w:rFonts w:hint="eastAsia" w:ascii="宋体" w:hAnsi="宋体" w:eastAsia="宋体" w:cs="宋体"/>
+          <w:rFonts w:hint="eastAsia" w:ascii="黑体" w:hAnsi="黑体" w:eastAsia="黑体" w:cs="黑体"/>
           <w:b/>
           <w:color w:val="1D1D1F"/>
           <w:sz w:val="30"/>
         </w:rPr>
-        <w:t xml:space="preserve"> 复现结论与后续检查</w:t>
+        <w:t>复现结论与后续检查</w:t>
       </w:r>
     </w:p>
     <w:p>
@@ -2419,7 +2457,7 @@
           <w:color w:val="1D1D1F"/>
           <w:sz w:val="21"/>
         </w:rPr>
-        <w:t>继续复现时应优先检查后端 /health 是否返回 healthy、/api/map/health 是否显示 live 和 mcp_tools_count=16，然后再打开前端页面。若地图加载失败但行程文字、预算和离线路线示意仍显示，应优先检查高德 Web JS Key、安全密钥和前端端口，而不是重复提交行程。</w:t>
+        <w:t>继续复现时应优先检查后端/health是否返回healthy、/api/map/health是否显示live和mcp_tools_count=16，然后再打开前端页面。若地图加载失败但行程文字、预算和离线路线示意仍显示，应优先检查高德WebJSKey、安全密钥和前端端口，而不是重复提交行程。</w:t>
       </w:r>
     </w:p>
     <w:p>
@@ -2822,11 +2860,11 @@
     <w:lsdException w:unhideWhenUsed="0" w:uiPriority="69" w:semiHidden="0" w:name="Medium Grid 3 Accent 1"/>
     <w:lsdException w:unhideWhenUsed="0" w:uiPriority="70" w:semiHidden="0" w:name="Dark List Accent 1"/>
     <w:lsdException w:unhideWhenUsed="0" w:uiPriority="71" w:semiHidden="0" w:name="Colorful Shading Accent 1"/>
-    <w:lsdException w:unhideWhenUsed="0" w:uiPriority="72" w:semiHidden="0" w:name="Colorful List Accent 1"/>
+    <w:lsdException w:qFormat="1" w:unhideWhenUsed="0" w:uiPriority="72" w:semiHidden="0" w:name="Colorful List Accent 1"/>
     <w:lsdException w:unhideWhenUsed="0" w:uiPriority="73" w:semiHidden="0" w:name="Colorful Grid Accent 1"/>
     <w:lsdException w:unhideWhenUsed="0" w:uiPriority="60" w:semiHidden="0" w:name="Light Shading Accent 2"/>
     <w:lsdException w:unhideWhenUsed="0" w:uiPriority="61" w:semiHidden="0" w:name="Light List Accent 2"/>
-    <w:lsdException w:unhideWhenUsed="0" w:uiPriority="62" w:semiHidden="0" w:name="Light Grid Accent 2"/>
+    <w:lsdException w:qFormat="1" w:unhideWhenUsed="0" w:uiPriority="62" w:semiHidden="0" w:name="Light Grid Accent 2"/>
     <w:lsdException w:unhideWhenUsed="0" w:uiPriority="63" w:semiHidden="0" w:name="Medium Shading 1 Accent 2"/>
     <w:lsdException w:unhideWhenUsed="0" w:uiPriority="64" w:semiHidden="0" w:name="Medium Shading 2 Accent 2"/>
     <w:lsdException w:unhideWhenUsed="0" w:uiPriority="65" w:semiHidden="0" w:name="Medium List 1 Accent 2"/>
@@ -2878,11 +2916,11 @@
     <w:lsdException w:unhideWhenUsed="0" w:uiPriority="69" w:semiHidden="0" w:name="Medium Grid 3 Accent 5"/>
     <w:lsdException w:unhideWhenUsed="0" w:uiPriority="70" w:semiHidden="0" w:name="Dark List Accent 5"/>
     <w:lsdException w:unhideWhenUsed="0" w:uiPriority="71" w:semiHidden="0" w:name="Colorful Shading Accent 5"/>
-    <w:lsdException w:unhideWhenUsed="0" w:uiPriority="72" w:semiHidden="0" w:name="Colorful List Accent 5"/>
+    <w:lsdException w:qFormat="1" w:unhideWhenUsed="0" w:uiPriority="72" w:semiHidden="0" w:name="Colorful List Accent 5"/>
     <w:lsdException w:unhideWhenUsed="0" w:uiPriority="73" w:semiHidden="0" w:name="Colorful Grid Accent 5"/>
     <w:lsdException w:unhideWhenUsed="0" w:uiPriority="60" w:semiHidden="0" w:name="Light Shading Accent 6"/>
-    <w:lsdException w:unhideWhenUsed="0" w:uiPriority="61" w:semiHidden="0" w:name="Light List Accent 6"/>
-    <w:lsdException w:unhideWhenUsed="0" w:uiPriority="62" w:semiHidden="0" w:name="Light Grid Accent 6"/>
+    <w:lsdException w:qFormat="1" w:unhideWhenUsed="0" w:uiPriority="61" w:semiHidden="0" w:name="Light List Accent 6"/>
+    <w:lsdException w:qFormat="1" w:unhideWhenUsed="0" w:uiPriority="62" w:semiHidden="0" w:name="Light Grid Accent 6"/>
     <w:lsdException w:unhideWhenUsed="0" w:uiPriority="63" w:semiHidden="0" w:name="Medium Shading 1 Accent 6"/>
     <w:lsdException w:unhideWhenUsed="0" w:uiPriority="64" w:semiHidden="0" w:name="Medium Shading 2 Accent 6"/>
     <w:lsdException w:unhideWhenUsed="0" w:uiPriority="65" w:semiHidden="0" w:name="Medium List 1 Accent 6"/>
@@ -4752,6 +4790,7 @@
   <w:style w:type="table" w:styleId="48">
     <w:name w:val="Light List Accent 6"/>
     <w:basedOn w:val="33"/>
+    <w:qFormat/>
     <w:uiPriority w:val="61"/>
     <w:pPr>
       <w:spacing w:after="0" w:line="240" w:lineRule="auto"/>
@@ -5097,6 +5136,7 @@
   <w:style w:type="table" w:styleId="51">
     <w:name w:val="Light Grid Accent 2"/>
     <w:basedOn w:val="33"/>
+    <w:qFormat/>
     <w:uiPriority w:val="62"/>
     <w:pPr>
       <w:spacing w:after="0" w:line="240" w:lineRule="auto"/>
@@ -5602,6 +5642,7 @@
   <w:style w:type="table" w:styleId="55">
     <w:name w:val="Light Grid Accent 6"/>
     <w:basedOn w:val="33"/>
+    <w:qFormat/>
     <w:uiPriority w:val="62"/>
     <w:pPr>
       <w:spacing w:after="0" w:line="240" w:lineRule="auto"/>
@@ -13684,6 +13725,7 @@
   <w:style w:type="table" w:styleId="120">
     <w:name w:val="Colorful List Accent 1"/>
     <w:basedOn w:val="33"/>
+    <w:qFormat/>
     <w:uiPriority w:val="72"/>
     <w:pPr>
       <w:spacing w:after="0" w:line="240" w:lineRule="auto"/>
@@ -14052,6 +14094,7 @@
   <w:style w:type="table" w:styleId="124">
     <w:name w:val="Colorful List Accent 5"/>
     <w:basedOn w:val="33"/>
+    <w:qFormat/>
     <w:uiPriority w:val="72"/>
     <w:pPr>
       <w:spacing w:after="0" w:line="240" w:lineRule="auto"/>

</xml_diff>